<commit_message>
revisi template form purna reguler
</commit_message>
<xml_diff>
--- a/template_prapurna_reguler.docx
+++ b/template_prapurna_reguler.docx
@@ -15,27 +15,27 @@
           <w:u w:val="single"/>
         </w:rPr>
       </w:pPr>
-      <w:bookmarkStart w:id="0" w:name="OLE_LINK38"/>
-      <w:bookmarkStart w:id="1" w:name="OLE_LINK66"/>
-      <w:bookmarkStart w:id="2" w:name="OLE_LINK62"/>
-      <w:bookmarkStart w:id="3" w:name="OLE_LINK55"/>
-      <w:bookmarkStart w:id="4" w:name="OLE_LINK28"/>
-      <w:bookmarkStart w:id="5" w:name="OLE_LINK51"/>
-      <w:bookmarkStart w:id="6" w:name="OLE_LINK5"/>
-      <w:bookmarkStart w:id="7" w:name="OLE_LINK29"/>
-      <w:bookmarkStart w:id="8" w:name="OLE_LINK37"/>
-      <w:bookmarkStart w:id="9" w:name="OLE_LINK3"/>
-      <w:bookmarkStart w:id="10" w:name="OLE_LINK8"/>
-      <w:bookmarkStart w:id="11" w:name="OLE_LINK7"/>
-      <w:bookmarkStart w:id="12" w:name="OLE_LINK87"/>
-      <w:bookmarkStart w:id="13" w:name="OLE_LINK56"/>
-      <w:bookmarkStart w:id="14" w:name="OLE_LINK67"/>
-      <w:bookmarkStart w:id="15" w:name="OLE_LINK89"/>
-      <w:bookmarkStart w:id="16" w:name="OLE_LINK36"/>
-      <w:bookmarkStart w:id="17" w:name="OLE_LINK48"/>
-      <w:bookmarkStart w:id="18" w:name="OLE_LINK17"/>
-      <w:bookmarkStart w:id="19" w:name="OLE_LINK49"/>
-      <w:bookmarkStart w:id="20" w:name="OLE_LINK44"/>
+      <w:bookmarkStart w:id="0" w:name="OLE_LINK66"/>
+      <w:bookmarkStart w:id="1" w:name="OLE_LINK28"/>
+      <w:bookmarkStart w:id="2" w:name="OLE_LINK5"/>
+      <w:bookmarkStart w:id="3" w:name="OLE_LINK62"/>
+      <w:bookmarkStart w:id="4" w:name="OLE_LINK29"/>
+      <w:bookmarkStart w:id="5" w:name="OLE_LINK38"/>
+      <w:bookmarkStart w:id="6" w:name="OLE_LINK55"/>
+      <w:bookmarkStart w:id="7" w:name="OLE_LINK51"/>
+      <w:bookmarkStart w:id="8" w:name="OLE_LINK3"/>
+      <w:bookmarkStart w:id="9" w:name="OLE_LINK7"/>
+      <w:bookmarkStart w:id="10" w:name="OLE_LINK17"/>
+      <w:bookmarkStart w:id="11" w:name="OLE_LINK44"/>
+      <w:bookmarkStart w:id="12" w:name="OLE_LINK8"/>
+      <w:bookmarkStart w:id="13" w:name="OLE_LINK87"/>
+      <w:bookmarkStart w:id="14" w:name="OLE_LINK37"/>
+      <w:bookmarkStart w:id="15" w:name="OLE_LINK49"/>
+      <w:bookmarkStart w:id="16" w:name="OLE_LINK89"/>
+      <w:bookmarkStart w:id="17" w:name="OLE_LINK56"/>
+      <w:bookmarkStart w:id="18" w:name="OLE_LINK48"/>
+      <w:bookmarkStart w:id="19" w:name="OLE_LINK67"/>
+      <w:bookmarkStart w:id="20" w:name="OLE_LINK36"/>
       <w:r>
         <w:rPr>
           <w:rFonts w:hint="default" w:ascii="Kalinga" w:hAnsi="Kalinga"/>
@@ -1531,8 +1531,68 @@
           <w:color w:val="auto"/>
           <w:sz w:val="20"/>
           <w:szCs w:val="20"/>
-        </w:rPr>
-        <w:t xml:space="preserve">Mengajukan Kredit BNI Fleksi Pra Purna sebesar Rp. </w:t>
+          <w:lang w:val="en-US"/>
+        </w:rPr>
+        <w:t>Maksud m</w:t>
+      </w:r>
+      <w:r>
+        <w:rPr>
+          <w:rFonts w:hint="default" w:ascii="Kalinga" w:hAnsi="Kalinga"/>
+          <w:color w:val="auto"/>
+          <w:sz w:val="20"/>
+          <w:szCs w:val="20"/>
+        </w:rPr>
+        <w:t xml:space="preserve">engajukan </w:t>
+      </w:r>
+      <w:r>
+        <w:rPr>
+          <w:rFonts w:hint="default" w:ascii="Kalinga" w:hAnsi="Kalinga"/>
+          <w:color w:val="auto"/>
+          <w:sz w:val="20"/>
+          <w:szCs w:val="20"/>
+          <w:lang w:val="en-US"/>
+        </w:rPr>
+        <w:t>fasilitas k</w:t>
+      </w:r>
+      <w:r>
+        <w:rPr>
+          <w:rFonts w:hint="default" w:ascii="Kalinga" w:hAnsi="Kalinga"/>
+          <w:color w:val="auto"/>
+          <w:sz w:val="20"/>
+          <w:szCs w:val="20"/>
+        </w:rPr>
+        <w:t xml:space="preserve">redit BNI Fleksi </w:t>
+      </w:r>
+      <w:r>
+        <w:rPr>
+          <w:rFonts w:hint="default" w:ascii="Kalinga" w:hAnsi="Kalinga"/>
+          <w:color w:val="auto"/>
+          <w:sz w:val="20"/>
+          <w:szCs w:val="20"/>
+          <w:lang w:val="en-US"/>
+        </w:rPr>
+        <w:t>Pensiun {% if jenis_pengajuan == 'top_up' %}Pra Purna Top Up{% elif jenis_pengajuan == 'top_up_sisa_gaji' %}Pra Purna Top Up Sisa Gaji{% else %}Pra P</w:t>
+      </w:r>
+      <w:bookmarkStart w:id="52" w:name="_GoBack"/>
+      <w:bookmarkEnd w:id="52"/>
+      <w:r>
+        <w:rPr>
+          <w:rFonts w:hint="default" w:ascii="Kalinga" w:hAnsi="Kalinga"/>
+          <w:color w:val="auto"/>
+          <w:sz w:val="20"/>
+          <w:szCs w:val="20"/>
+          <w:lang w:val="en-US"/>
+        </w:rPr>
+        <w:t xml:space="preserve">urna Reguler{% endif %} </w:t>
+      </w:r>
+      <w:r>
+        <w:rPr>
+          <w:rFonts w:hint="default" w:ascii="Kalinga" w:hAnsi="Kalinga"/>
+          <w:color w:val="auto"/>
+          <w:sz w:val="20"/>
+          <w:szCs w:val="20"/>
+        </w:rPr>
+        <w:t xml:space="preserve">sebesar Rp. </w:t>
       </w:r>
       <w:r>
         <w:rPr>
@@ -2320,18 +2380,18 @@
         </w:rPr>
       </w:pPr>
       <w:bookmarkStart w:id="21" w:name="OLE_LINK71"/>
-      <w:bookmarkStart w:id="22" w:name="OLE_LINK21"/>
-      <w:bookmarkStart w:id="23" w:name="OLE_LINK52"/>
-      <w:bookmarkStart w:id="24" w:name="OLE_LINK39"/>
-      <w:bookmarkStart w:id="25" w:name="OLE_LINK10"/>
-      <w:bookmarkStart w:id="26" w:name="OLE_LINK20"/>
-      <w:bookmarkStart w:id="27" w:name="OLE_LINK88"/>
-      <w:bookmarkStart w:id="28" w:name="OLE_LINK63"/>
-      <w:bookmarkStart w:id="29" w:name="OLE_LINK90"/>
-      <w:bookmarkStart w:id="30" w:name="OLE_LINK54"/>
-      <w:bookmarkStart w:id="31" w:name="OLE_LINK73"/>
-      <w:bookmarkStart w:id="32" w:name="OLE_LINK61"/>
-      <w:bookmarkStart w:id="33" w:name="OLE_LINK68"/>
+      <w:bookmarkStart w:id="22" w:name="OLE_LINK90"/>
+      <w:bookmarkStart w:id="23" w:name="OLE_LINK73"/>
+      <w:bookmarkStart w:id="24" w:name="OLE_LINK61"/>
+      <w:bookmarkStart w:id="25" w:name="OLE_LINK68"/>
+      <w:bookmarkStart w:id="26" w:name="OLE_LINK21"/>
+      <w:bookmarkStart w:id="27" w:name="OLE_LINK10"/>
+      <w:bookmarkStart w:id="28" w:name="OLE_LINK52"/>
+      <w:bookmarkStart w:id="29" w:name="OLE_LINK20"/>
+      <w:bookmarkStart w:id="30" w:name="OLE_LINK88"/>
+      <w:bookmarkStart w:id="31" w:name="OLE_LINK63"/>
+      <w:bookmarkStart w:id="32" w:name="OLE_LINK54"/>
+      <w:bookmarkStart w:id="33" w:name="OLE_LINK39"/>
       <w:bookmarkStart w:id="34" w:name="OLE_LINK45"/>
     </w:p>
     <w:p>
@@ -3235,8 +3295,8 @@
           <w:lang w:val="en-US"/>
         </w:rPr>
       </w:pPr>
-      <w:bookmarkStart w:id="35" w:name="OLE_LINK25"/>
-      <w:bookmarkStart w:id="36" w:name="OLE_LINK18"/>
+      <w:bookmarkStart w:id="35" w:name="OLE_LINK18"/>
+      <w:bookmarkStart w:id="36" w:name="OLE_LINK25"/>
       <w:bookmarkStart w:id="37" w:name="OLE_LINK9"/>
       <w:r>
         <w:rPr>
@@ -8734,9 +8794,9 @@
           <w:szCs w:val="20"/>
         </w:rPr>
       </w:pPr>
-      <w:bookmarkStart w:id="45" w:name="OLE_LINK58"/>
-      <w:bookmarkStart w:id="46" w:name="OLE_LINK24"/>
-      <w:bookmarkStart w:id="47" w:name="OLE_LINK64"/>
+      <w:bookmarkStart w:id="45" w:name="OLE_LINK24"/>
+      <w:bookmarkStart w:id="46" w:name="OLE_LINK64"/>
+      <w:bookmarkStart w:id="47" w:name="OLE_LINK58"/>
       <w:bookmarkStart w:id="48" w:name="OLE_LINK40"/>
       <w:bookmarkStart w:id="49" w:name="OLE_LINK13"/>
       <w:bookmarkStart w:id="50" w:name="OLE_LINK23"/>
@@ -8946,8 +9006,6 @@
           <w:lang w:val="en-US"/>
         </w:rPr>
       </w:pPr>
-      <w:bookmarkStart w:id="52" w:name="_GoBack"/>
-      <w:bookmarkEnd w:id="52"/>
       <w:r>
         <w:rPr>
           <w:rFonts w:hint="default" w:ascii="Kalinga" w:hAnsi="Kalinga" w:cs="Kalinga"/>

</xml_diff>

<commit_message>
memperbaiki form purna reguler dan script.js
</commit_message>
<xml_diff>
--- a/template_prapurna_reguler.docx
+++ b/template_prapurna_reguler.docx
@@ -15,27 +15,29 @@
           <w:u w:val="single"/>
         </w:rPr>
       </w:pPr>
+      <w:bookmarkStart w:id="52" w:name="_GoBack"/>
+      <w:bookmarkEnd w:id="52"/>
       <w:bookmarkStart w:id="0" w:name="OLE_LINK66"/>
       <w:bookmarkStart w:id="1" w:name="OLE_LINK28"/>
       <w:bookmarkStart w:id="2" w:name="OLE_LINK5"/>
       <w:bookmarkStart w:id="3" w:name="OLE_LINK62"/>
-      <w:bookmarkStart w:id="4" w:name="OLE_LINK29"/>
-      <w:bookmarkStart w:id="5" w:name="OLE_LINK38"/>
-      <w:bookmarkStart w:id="6" w:name="OLE_LINK55"/>
-      <w:bookmarkStart w:id="7" w:name="OLE_LINK51"/>
-      <w:bookmarkStart w:id="8" w:name="OLE_LINK3"/>
-      <w:bookmarkStart w:id="9" w:name="OLE_LINK7"/>
-      <w:bookmarkStart w:id="10" w:name="OLE_LINK17"/>
-      <w:bookmarkStart w:id="11" w:name="OLE_LINK44"/>
-      <w:bookmarkStart w:id="12" w:name="OLE_LINK8"/>
-      <w:bookmarkStart w:id="13" w:name="OLE_LINK87"/>
-      <w:bookmarkStart w:id="14" w:name="OLE_LINK37"/>
-      <w:bookmarkStart w:id="15" w:name="OLE_LINK49"/>
-      <w:bookmarkStart w:id="16" w:name="OLE_LINK89"/>
-      <w:bookmarkStart w:id="17" w:name="OLE_LINK56"/>
-      <w:bookmarkStart w:id="18" w:name="OLE_LINK48"/>
-      <w:bookmarkStart w:id="19" w:name="OLE_LINK67"/>
-      <w:bookmarkStart w:id="20" w:name="OLE_LINK36"/>
+      <w:bookmarkStart w:id="4" w:name="OLE_LINK55"/>
+      <w:bookmarkStart w:id="5" w:name="OLE_LINK51"/>
+      <w:bookmarkStart w:id="6" w:name="OLE_LINK38"/>
+      <w:bookmarkStart w:id="7" w:name="OLE_LINK29"/>
+      <w:bookmarkStart w:id="8" w:name="OLE_LINK37"/>
+      <w:bookmarkStart w:id="9" w:name="OLE_LINK67"/>
+      <w:bookmarkStart w:id="10" w:name="OLE_LINK89"/>
+      <w:bookmarkStart w:id="11" w:name="OLE_LINK56"/>
+      <w:bookmarkStart w:id="12" w:name="OLE_LINK49"/>
+      <w:bookmarkStart w:id="13" w:name="OLE_LINK36"/>
+      <w:bookmarkStart w:id="14" w:name="OLE_LINK44"/>
+      <w:bookmarkStart w:id="15" w:name="OLE_LINK48"/>
+      <w:bookmarkStart w:id="16" w:name="OLE_LINK87"/>
+      <w:bookmarkStart w:id="17" w:name="OLE_LINK3"/>
+      <w:bookmarkStart w:id="18" w:name="OLE_LINK7"/>
+      <w:bookmarkStart w:id="19" w:name="OLE_LINK17"/>
+      <w:bookmarkStart w:id="20" w:name="OLE_LINK8"/>
       <w:r>
         <w:rPr>
           <w:rFonts w:hint="default" w:ascii="Kalinga" w:hAnsi="Kalinga"/>
@@ -1571,19 +1573,7 @@
           <w:szCs w:val="20"/>
           <w:lang w:val="en-US"/>
         </w:rPr>
-        <w:t>Pensiun {% if jenis_pengajuan == 'top_up' %}Pra Purna Top Up{% elif jenis_pengajuan == 'top_up_sisa_gaji' %}Pra Purna Top Up Sisa Gaji{% else %}Pra P</w:t>
-      </w:r>
-      <w:bookmarkStart w:id="52" w:name="_GoBack"/>
-      <w:bookmarkEnd w:id="52"/>
-      <w:r>
-        <w:rPr>
-          <w:rFonts w:hint="default" w:ascii="Kalinga" w:hAnsi="Kalinga"/>
-          <w:color w:val="auto"/>
-          <w:sz w:val="20"/>
-          <w:szCs w:val="20"/>
-          <w:lang w:val="en-US"/>
-        </w:rPr>
-        <w:t xml:space="preserve">urna Reguler{% endif %} </w:t>
+        <w:t xml:space="preserve">Pensiun {% if jenis_pengajuan == 'top_up' %}Prapurna Top Up{% elif jenis_pengajuan == 'top_up_sisa_gaji' %}Prapurna Top Up Sisa Gaji{% else %}Prapurna Reguler{% endif %} </w:t>
       </w:r>
       <w:r>
         <w:rPr>
@@ -2380,19 +2370,19 @@
         </w:rPr>
       </w:pPr>
       <w:bookmarkStart w:id="21" w:name="OLE_LINK71"/>
-      <w:bookmarkStart w:id="22" w:name="OLE_LINK90"/>
+      <w:bookmarkStart w:id="22" w:name="OLE_LINK61"/>
       <w:bookmarkStart w:id="23" w:name="OLE_LINK73"/>
-      <w:bookmarkStart w:id="24" w:name="OLE_LINK61"/>
-      <w:bookmarkStart w:id="25" w:name="OLE_LINK68"/>
-      <w:bookmarkStart w:id="26" w:name="OLE_LINK21"/>
-      <w:bookmarkStart w:id="27" w:name="OLE_LINK10"/>
-      <w:bookmarkStart w:id="28" w:name="OLE_LINK52"/>
-      <w:bookmarkStart w:id="29" w:name="OLE_LINK20"/>
-      <w:bookmarkStart w:id="30" w:name="OLE_LINK88"/>
-      <w:bookmarkStart w:id="31" w:name="OLE_LINK63"/>
+      <w:bookmarkStart w:id="24" w:name="OLE_LINK20"/>
+      <w:bookmarkStart w:id="25" w:name="OLE_LINK52"/>
+      <w:bookmarkStart w:id="26" w:name="OLE_LINK39"/>
+      <w:bookmarkStart w:id="27" w:name="OLE_LINK68"/>
+      <w:bookmarkStart w:id="28" w:name="OLE_LINK21"/>
+      <w:bookmarkStart w:id="29" w:name="OLE_LINK90"/>
+      <w:bookmarkStart w:id="30" w:name="OLE_LINK10"/>
+      <w:bookmarkStart w:id="31" w:name="OLE_LINK88"/>
       <w:bookmarkStart w:id="32" w:name="OLE_LINK54"/>
-      <w:bookmarkStart w:id="33" w:name="OLE_LINK39"/>
-      <w:bookmarkStart w:id="34" w:name="OLE_LINK45"/>
+      <w:bookmarkStart w:id="33" w:name="OLE_LINK45"/>
+      <w:bookmarkStart w:id="34" w:name="OLE_LINK63"/>
     </w:p>
     <w:p>
       <w:pPr>
@@ -8409,7 +8399,7 @@
           <w:szCs w:val="20"/>
           <w:lang w:val="en-US"/>
         </w:rPr>
-        <w:t>Apabila Dana Blokir tersebut dipotong dari pencairan kredit, pemohon wajib meyerahkan Surat Pernyataan yang isinya meminta kepada bank agar dana blokir rekening sebesar Angsuran perbulan dikali masa Pra Purna (masa sebelum Pensiun) dipotong dari dana pencairan Kredit.</w:t>
+        <w:t>Apabila Dana Blokir tersebut dipotong dari pencairan kredit, pemohon wajib meyerahkan Surat Pernyataan yang isinya meminta kepada bank agar dana blokir rekening sebesar Angsuran perbulan dikali masa Prapurna (masa sebelum Pensiun) dipotong dari dana pencairan Kredit.</w:t>
       </w:r>
     </w:p>
     <w:p>
@@ -8795,12 +8785,12 @@
         </w:rPr>
       </w:pPr>
       <w:bookmarkStart w:id="45" w:name="OLE_LINK24"/>
-      <w:bookmarkStart w:id="46" w:name="OLE_LINK64"/>
-      <w:bookmarkStart w:id="47" w:name="OLE_LINK58"/>
+      <w:bookmarkStart w:id="46" w:name="OLE_LINK58"/>
+      <w:bookmarkStart w:id="47" w:name="OLE_LINK13"/>
       <w:bookmarkStart w:id="48" w:name="OLE_LINK40"/>
-      <w:bookmarkStart w:id="49" w:name="OLE_LINK13"/>
-      <w:bookmarkStart w:id="50" w:name="OLE_LINK23"/>
-      <w:bookmarkStart w:id="51" w:name="OLE_LINK70"/>
+      <w:bookmarkStart w:id="49" w:name="OLE_LINK70"/>
+      <w:bookmarkStart w:id="50" w:name="OLE_LINK64"/>
+      <w:bookmarkStart w:id="51" w:name="OLE_LINK23"/>
       <w:r>
         <w:rPr>
           <w:rFonts w:ascii="Kalinga" w:hAnsi="Kalinga" w:cs="Kalinga"/>

</xml_diff>